<commit_message>
Publish Future Path 1.0.1 display scaling fix and direct download
</commit_message>
<xml_diff>
--- a/FuturePath-LocalDB/docs/FuturePath-System-Specification.docx
+++ b/FuturePath-LocalDB/docs/FuturePath-System-Specification.docx
@@ -434,7 +434,7 @@
     </w:p>
     <w:p>
       <w:r>
-        <w:t>Forms are DPI-aware, have a minimum size, and scroll when content exceeds the available space. Standard controls support keyboard focus and Tab navigation. Inputs have accessible names. Dialogs use consistent Save/Cancel actions. Failed validations explain the field or rule that needs attention; destructive navigation and subject removal use confirmations. Saved assessments become read-only, and follow-ups preserve the previous session.</w:t>
+        <w:t>Forms/pages declare a shared 96-DPI design baseline with PerMonitorV2 awareness. Layout is suspended during construction, including dynamically opened pages and retained learner steps. The sidebar follows monitor DPI; headers/footer use automatic height; cards and labels fit the viewport up to a reading-width cap. The initial main window fits the monitor working area and pages scroll when content exceeds the available space. Standard controls support keyboard focus and Tab navigation. Inputs have accessible names. Dialogs use consistent Save/Cancel actions. Failed validations explain the field or rule that needs attention; destructive navigation and subject removal use confirmations. Saved assessments become read-only, and follow-ups preserve the previous session.</w:t>
       </w:r>
     </w:p>
     <w:p>
@@ -4836,7 +4836,7 @@
     </w:p>
     <w:p>
       <w:r>
-        <w:t>Four Windows tests construct form/editor/report controls, drive real learner capture/save, check Back/Next retention and absence of early writes, and verify that report/editor controls do not open a second main window. They are not claimed as executed in Linux. Manual Windows acceptance covers layout at 100/125/150% DPI, keyboard navigation, real printing/PDF, offline use, second-instance protection, save cancellation and filesystem failures.</w:t>
+        <w:t>Four Windows tests construct form/editor/report controls, drive real learner capture/save, check Back/Next retention and absence of early writes, and verify that report/editor controls do not open a second main window. Three additional overview resize cases check card/sidebar bounds at 960/1280/1600 logical pixels on the host display. Windows UI cases are not claimed as executed in Linux. Manual Windows acceptance covers layout at 100/125/150/200% DPI, keyboard navigation, real printing/PDF, offline use, second-instance protection, save cancellation and filesystem failures.</w:t>
       </w:r>
     </w:p>
     <w:p>
@@ -4880,7 +4880,7 @@
     </w:p>
     <w:p>
       <w:r>
-        <w:t>Setup is explicit through Database/01–04 and SETUP-DEMO.cmd. Startup verifies SchemaVersion and never drops/recreates/seeds. SchemaVersion is metadata in addition to the 20 domain entities shown above. No existing SQLite data file was attached; those files are left untouched. The transferred reference inputs and generated SQL outcomes are retained under validation/reference and Database/03_SeedData.sql.</w:t>
+        <w:t>Setup is explicit through the in-app Prepare demonstration database button, or optionally Database/01–04 and SETUP-DEMO.cmd. The default FuturePath.sln opens the Windows Forms project; F5 shows MainForm before background SchemaVersion verification. Ordinary startup never drops, resets or silently seeds. In-app setup runs embedded Database/01–03 and preserves nonempty databases. SchemaVersion is metadata in addition to the 20 domain entities shown above. No existing SQLite data file was attached; those files are left untouched. The transferred reference inputs and generated SQL outcomes are retained under validation/reference and Database/03_SeedData.sql.</w:t>
       </w:r>
     </w:p>
     <w:p>
@@ -12296,12 +12296,12 @@
     </w:p>
     <w:p>
       <w:r>
-        <w:t>Open **FuturePath-App.sln**, build and press F5. In the full solution the startup project is **FuturePath.Desktop**, not a test project. `RUN-FUTUREPATH.cmd` builds only Desktop and starts its Windows executable.</w:t>
-      </w:r>
-    </w:p>
-    <w:p>
-      <w:r>
-        <w:t>`src/FuturePath.Desktop/Program.cs` configures Windows Forms, chooses the LocalDB database name (default `FuturePathStudentAdvisingSystem`), prevents a second app instance for that name, verifies setup with `SqlServerStore.Initialize()`, and opens **one MainForm**. It does not create/seed/delete databases at startup. `AppServices` constructs the access session and business services. This is direct construction, not a dependency-injection framework.</w:t>
+        <w:t>Open **FuturePath.sln**, build and press F5. This solution contains only **FuturePath.Desktop** and its two supporting libraries. **FuturePath.Development.sln** additionally includes the tests. `RUN-FUTUREPATH.cmd` builds only Desktop and starts its Windows executable.</w:t>
+      </w:r>
+    </w:p>
+    <w:p>
+      <w:r>
+        <w:t>`src/FuturePath.Desktop/Program.cs` configures Windows Forms, chooses the LocalDB database name (default `FuturePathStudentAdvisingSystem`), prevents a second app instance for that name, opens **one MainForm** immediately, then verifies setup with `SqlServerStore.Initialize()` in a background task. If the database needs preparation, MainForm offers **Prepare demonstration database**. This explicit action calls `DatabaseSetup.PrepareDemo` using the embedded SQL scripts, then returns to the overview in the same window. Existing nonempty databases are not reseeded; no database is deleted or reset. `AppServices` constructs the access session and business services. This is direct construction, not a dependency-injection framework.</w:t>
       </w:r>
     </w:p>
     <w:p>
@@ -12891,6 +12891,19 @@
     <w:p>
       <w:r>
         <w:t>The portable checks execute real rules/validation/report composition against reference input fixtures. They are **not** SQL integration tests. Run the complete suite on Windows with LocalDB and collect manual layout/printing evidence before presenting. Do not claim an unrun test or an invented group contribution.</w:t>
+      </w:r>
+    </w:p>
+    <w:p>
+      <w:pPr>
+        <w:pStyle w:val="Heading2"/>
+      </w:pPr>
+      <w:r>
+        <w:t>Display sizing</w:t>
+      </w:r>
+    </w:p>
+    <w:p>
+      <w:r>
+        <w:t>`AppForm` in Ui.cs and `AppPage` in LayoutControls.cs declare a 96-DPI design baseline. Their constructors suspend layout; derived forms/pages call FinishLayout after building their controls. This also applies to pages created after the main window is visible. AdvisingPage wraps each retained step in an AppPage when first visited. `PageStack` and `ContentCard` fit cards and text to the viewport, with a reading-width cap; MainForm.ArrangeNavigation derives sidebar sizes from DeviceDpi and available width. Header/footer use automatic height. Layout tests compile for Windows; the actual DPI matrix remains a manual Windows check.</w:t>
       </w:r>
     </w:p>
     <w:p>
@@ -13171,7 +13184,7 @@
           <w:rFonts w:ascii="Consolas" w:hAnsi="Consolas"/>
           <w:sz w:val="16"/>
         </w:rPr>
-        <w:t>dotnet restore FuturePath.sln --locked-mode</w:t>
+        <w:t>dotnet restore FuturePath.Development.sln --locked-mode</w:t>
       </w:r>
     </w:p>
     <w:p>
@@ -13183,7 +13196,7 @@
           <w:rFonts w:ascii="Consolas" w:hAnsi="Consolas"/>
           <w:sz w:val="16"/>
         </w:rPr>
-        <w:t>dotnet build FuturePath.sln -c Release --no-restore</w:t>
+        <w:t>dotnet build FuturePath.Development.sln -c Release --no-restore</w:t>
       </w:r>
     </w:p>
     <w:p>
@@ -13444,7 +13457,7 @@
           </w:tcPr>
           <w:p>
             <w:r>
-              <w:t>Select database name instead of file path; verify setup; keep mutex and MainForm startup</w:t>
+              <w:t>Select database name instead of file path; keep mutex; open MainForm before background verification and offer explicit in-app demo setup</w:t>
             </w:r>
           </w:p>
         </w:tc>
@@ -13698,7 +13711,7 @@
           </w:tcPr>
           <w:p>
             <w:r>
-              <w:t>`FuturePath-App.sln`, `RUN-FUTUREPATH.cmd`</w:t>
+              <w:t>`FuturePath.sln`, `FuturePath.Development.sln`</w:t>
             </w:r>
           </w:p>
         </w:tc>
@@ -13708,7 +13721,7 @@
           </w:tcPr>
           <w:p>
             <w:r>
-              <w:t>Make app startup unambiguous; tests remain in original full solution</w:t>
+              <w:t>Default solution contains only Desktop/Business/Data; complete test solution is separate</w:t>
             </w:r>
           </w:p>
         </w:tc>
@@ -13720,7 +13733,7 @@
           </w:tcPr>
           <w:p>
             <w:r>
-              <w:t>`SETUP-DEMO.cmd`, setup helper</w:t>
+              <w:t>`DatabaseSetup.cs`, Data embedded resources, MainForm startup</w:t>
             </w:r>
           </w:p>
         </w:tc>
@@ -13730,7 +13743,7 @@
           </w:tcPr>
           <w:p>
             <w:r>
-              <w:t>Explicit beginner setup without assuming sqlcmd is installed; manual SQL route for blocked PowerShell policy</w:t>
+              <w:t>Open the GUI first; prepare demo data explicitly inside the same window using the canonical SQL scripts</w:t>
             </w:r>
           </w:p>
         </w:tc>
@@ -13742,6 +13755,28 @@
           </w:tcPr>
           <w:p>
             <w:r>
+              <w:t>`SETUP-DEMO.cmd`, setup helper</w:t>
+            </w:r>
+          </w:p>
+        </w:tc>
+        <w:tc>
+          <w:tcPr>
+            <w:tcW w:type="dxa" w:w="4320"/>
+          </w:tcPr>
+          <w:p>
+            <w:r>
+              <w:t>Explicit beginner setup without assuming sqlcmd is installed; manual SQL route for blocked PowerShell policy</w:t>
+            </w:r>
+          </w:p>
+        </w:tc>
+      </w:tr>
+      <w:tr>
+        <w:tc>
+          <w:tcPr>
+            <w:tcW w:type="dxa" w:w="4320"/>
+          </w:tcPr>
+          <w:p>
+            <w:r>
               <w:t>Docs/diagrams/Word, CI/packaging/cloud scripts</w:t>
             </w:r>
           </w:p>
@@ -13771,6 +13806,11 @@
     <w:p>
       <w:r>
         <w:t>Remaining before demonstration: real Windows LocalDB setup/repeat/save/reopen/constraint/lockout/backup tests, the four Windows UI tests, manual DPI/keyboard/print/offline/error cases and team review against the approved specification. Source, grammar validation and portable tests cannot establish those Windows outcomes.</w:t>
+      </w:r>
+    </w:p>
+    <w:p>
+      <w:r>
+        <w:t>Display correction 1.0.1 adds LayoutControls.cs (AppPage/PageStack/ContentCard), declares matching DPI baselines in AppForm, adapts MainForm navigation/header/window bounds and completes layout in each learner/staff/report page. Three Windows-only overview resize cases were added. Runtime DPI checks remain pending; no database schema/data/rule change is part of this correction.</w:t>
       </w:r>
     </w:p>
     <w:sectPr>

</xml_diff>